<commit_message>
Added media queries for manual css.
</commit_message>
<xml_diff>
--- a/Task 1/i230549_B_AI_Changes_Analysis.docx
+++ b/Task 1/i230549_B_AI_Changes_Analysis.docx
@@ -22,6 +22,18 @@
           <w:u w:val="single"/>
         </w:rPr>
         <w:t>AI Changes Analysis</w:t>
+      </w:r>
+    </w:p>
+    <w:p>
+      <w:r>
+        <w:rPr>
+          <w:b/>
+          <w:bCs/>
+        </w:rPr>
+        <w:t xml:space="preserve">Github: </w:t>
+      </w:r>
+      <w:r>
+        <w:t>https://github.com/MustafaAhsanKhan/Web-Programming</w:t>
       </w:r>
     </w:p>
     <w:p>

</xml_diff>